<commit_message>
Recitals: treat $90k as reference only; remove 'remaining $90k' as retained asset
Wife's incoming ~$90k was fully applied ($30k savings + $48k house +
$12k 401k), so Section 2 no longer claims a remaining $90k; the
breakdown now appears as a reference recital only.

Co-Authored-By: Claude Opus 4.8 <noreply@anthropic.com>
Claude-Session: https://claude.ai/code/session_01SRjhEDgfeyhAhB51UGe879
</commit_message>
<xml_diff>
--- a/Penny_Separation_Agreement_DRAFT.docx
+++ b/Penny_Separation_Agreement_DRAFT.docx
@@ -89,6 +89,18 @@
     </w:p>
     <w:p>
       <w:pPr>
+        <w:spacing w:after="120"/>
+      </w:pPr>
+      <w:r>
+        <w:rPr>
+          <w:b w:val="0"/>
+          <w:i w:val="0"/>
+        </w:rPr>
+        <w:t>D. For reference only, Wife entered the marriage with approximately $90,000 received from her prior divorce, which was applied approximately as follows: $30,000 to the parties’ savings, $48,000 to the down payment on the residence, and $12,000 to Wife’s retirement account.</w:t>
+      </w:r>
+    </w:p>
+    <w:p>
+      <w:pPr>
         <w:spacing w:after="160"/>
       </w:pPr>
       <w:r>
@@ -96,7 +108,7 @@
           <w:b w:val="0"/>
           <w:i w:val="0"/>
         </w:rPr>
-        <w:t>D. The parties desire to settle, fully and finally, all rights and obligations arising from their marriage, including all rights to property (equitable distribution), spousal support, and related claims.</w:t>
+        <w:t>E. The parties desire to settle, fully and finally, all rights and obligations arising from their marriage, including all rights to property (equitable distribution), spousal support, and related claims.</w:t>
       </w:r>
     </w:p>
     <w:p>
@@ -150,7 +162,7 @@
         <w:spacing w:after="80"/>
       </w:pPr>
       <w:r>
-        <w:t>Wife shall retain as her sole and separate property: (a) the approximately $30,000 in savings previously delivered to her by Husband; (b) her motor vehicle (approx. $17,000); and (c) the remainder of the funds she brought into the marriage (approximately $90,000 received from her prior divorce), together with any account holding those funds.</w:t>
+        <w:t>Wife shall retain as her sole and separate property the approximately $30,000 in savings previously delivered to her by Husband, together with any account holding her separate funds. Wife’s motor vehicle and retirement account are addressed in Sections 6 and 4 below.</w:t>
       </w:r>
     </w:p>
     <w:p>

</xml_diff>